<commit_message>
Add Work Order & Agreement tab, MB Scrutiny list, and same-work upload guard
- New Work Order and Agreement Bond documents (with Schedule A) filled from
  the Online Intimation + L1 selection form + Works List row
- MB Scrutiny list tab
- Guard both Intimation and Work Order/Agreement so the two uploaded files
  must belong to the same work (matched by NIT No, agency-name fallback);
  reservation is not part of the check
- Show Zone/Circle under the app name from the Works List when not logged in
- Bump to 0.1.13

Co-Authored-By: Claude Opus 4.8 <noreply@anthropic.com>
</commit_message>
<xml_diff>
--- a/resources/intimation-template.docx
+++ b/resources/intimation-template.docx
@@ -177,7 +177,7 @@
           <w:iCs/>
           <w:lang w:val="en-US"/>
         </w:rPr>
-        <w:t>Nizampet Circle-58</w:t>
+        <w:t>{{Circle}} Circle-{{CNO}}</w:t>
       </w:r>
       <w:r>
         <w:rPr>
@@ -334,142 +334,182 @@
         <w:t xml:space="preserve">Hyderabad. </w:t>
       </w:r>
     </w:p>
+    <w:tbl>
+      <w:tblPr>
+        <w:tblW w:w="9360" w:type="dxa"/>
+        <w:tblBorders>
+          <w:top w:val="nil"/>
+          <w:left w:val="nil"/>
+          <w:bottom w:val="single" w:sz="12" w:space="0" w:color="auto"/>
+          <w:right w:val="nil"/>
+          <w:insideH w:val="nil"/>
+          <w:insideV w:val="nil"/>
+        </w:tblBorders>
+        <w:tblCellMar>
+          <w:top w:w="0" w:type="dxa"/>
+          <w:left w:w="0" w:type="dxa"/>
+          <w:bottom w:w="0" w:type="dxa"/>
+          <w:right w:w="0" w:type="dxa"/>
+        </w:tblCellMar>
+        <w:tblLayout w:type="fixed"/>
+        <w:tblLook w:val="0000" w:firstRow="0" w:lastRow="0" w:firstColumn="0" w:lastColumn="0" w:noHBand="0" w:noVBand="0"/>
+      </w:tblPr>
+      <w:tblGrid>
+        <w:gridCol w:w="6480"/>
+        <w:gridCol w:w="2880"/>
+      </w:tblGrid>
+      <w:tr>
+        <w:tc>
+          <w:tcPr>
+            <w:tcW w:w="6480" w:type="dxa"/>
+            <w:tcBorders>
+              <w:bottom w:val="single" w:sz="12" w:space="0" w:color="auto"/>
+            </w:tcBorders>
+          </w:tcPr>
+          <w:p>
+            <w:pPr>
+              <w:pStyle w:val="NoSpacing"/>
+            </w:pPr>
+            <w:r>
+              <w:rPr>
+                <w:rFonts w:ascii="Times New Roman" w:hAnsi="Times New Roman"/>
+                <w:b/>
+                <w:bCs/>
+                <w:sz w:val="20"/>
+                <w:lang w:val="en-US"/>
+              </w:rPr>
+              <w:t xml:space="preserve">Lr. No:     </w:t>
+            </w:r>
+            <w:r>
+              <w:rPr>
+                <w:rFonts w:ascii="Times New Roman" w:hAnsi="Times New Roman"/>
+                <w:b/>
+                <w:bCs/>
+                <w:sz w:val="20"/>
+                <w:lang w:val="en-US"/>
+              </w:rPr>
+              <w:t xml:space="preserve">    /EE/</w:t>
+            </w:r>
+            <w:r>
+              <w:rPr>
+                <w:rFonts w:ascii="Times New Roman" w:hAnsi="Times New Roman"/>
+                <w:b/>
+                <w:bCs/>
+              </w:rPr>
+              <w:t>{{Circle}}/CIR-{{CNO}}</w:t>
+            </w:r>
+            <w:r>
+              <w:rPr>
+                <w:rFonts w:ascii="Times New Roman" w:hAnsi="Times New Roman"/>
+                <w:b/>
+                <w:bCs/>
+              </w:rPr>
+              <w:t>/</w:t>
+            </w:r>
+            <w:r>
+              <w:rPr>
+                <w:rFonts w:ascii="Times New Roman" w:hAnsi="Times New Roman"/>
+                <w:b/>
+                <w:bCs/>
+              </w:rPr>
+              <w:t>QBZ/CMC</w:t>
+            </w:r>
+            <w:r>
+              <w:rPr>
+                <w:rFonts w:ascii="Times New Roman" w:hAnsi="Times New Roman"/>
+                <w:b/>
+                <w:bCs/>
+              </w:rPr>
+              <w:t>/</w:t>
+            </w:r>
+            <w:r>
+              <w:rPr>
+                <w:rFonts w:ascii="Times New Roman" w:hAnsi="Times New Roman"/>
+                <w:b/>
+                <w:bCs/>
+              </w:rPr>
+              <w:t>{</w:t>
+            </w:r>
+            <w:r>
+              <w:rPr>
+                <w:rFonts w:ascii="Times New Roman" w:hAnsi="Times New Roman"/>
+                <w:b/>
+                <w:bCs/>
+              </w:rPr>
+              <w:t>{Financial year</w:t>
+            </w:r>
+            <w:r>
+              <w:rPr>
+                <w:rFonts w:ascii="Times New Roman" w:hAnsi="Times New Roman"/>
+                <w:b/>
+                <w:bCs/>
+              </w:rPr>
+              <w:t>}}</w:t>
+            </w:r>
+          </w:p>
+        </w:tc>
+        <w:tc>
+          <w:tcPr>
+            <w:tcW w:w="2880" w:type="dxa"/>
+            <w:tcBorders>
+              <w:bottom w:val="single" w:sz="12" w:space="0" w:color="auto"/>
+            </w:tcBorders>
+          </w:tcPr>
+          <w:p>
+            <w:pPr>
+              <w:pStyle w:val="NoSpacing"/>
+              <w:jc w:val="right"/>
+            </w:pPr>
+            <w:r>
+              <w:rPr>
+                <w:rFonts w:ascii="Times New Roman" w:hAnsi="Times New Roman"/>
+                <w:b/>
+                <w:bCs/>
+                <w:sz w:val="20"/>
+                <w:lang w:val="en-US"/>
+              </w:rPr>
+              <w:t>Date:{</w:t>
+            </w:r>
+            <w:r>
+              <w:rPr>
+                <w:rFonts w:ascii="Times New Roman" w:hAnsi="Times New Roman"/>
+                <w:b/>
+                <w:bCs/>
+                <w:sz w:val="20"/>
+                <w:lang w:val="en-US"/>
+              </w:rPr>
+              <w:t>{</w:t>
+            </w:r>
+            <w:r>
+              <w:rPr>
+                <w:rFonts w:ascii="Times New Roman" w:hAnsi="Times New Roman"/>
+                <w:b/>
+                <w:bCs/>
+                <w:sz w:val="20"/>
+                <w:lang w:val="en-US"/>
+              </w:rPr>
+              <w:t>Pricebidopen</w:t>
+            </w:r>
+            <w:r>
+              <w:rPr>
+                <w:rFonts w:ascii="Times New Roman" w:hAnsi="Times New Roman"/>
+                <w:b/>
+                <w:bCs/>
+                <w:sz w:val="20"/>
+                <w:lang w:val="en-US"/>
+              </w:rPr>
+              <w:t>}}</w:t>
+            </w:r>
+          </w:p>
+        </w:tc>
+      </w:tr>
+    </w:tbl>
     <w:p>
       <w:pPr>
         <w:pStyle w:val="NoSpacing"/>
         <w:jc w:val="both"/>
         <w:rPr>
           <w:rFonts w:ascii="Times New Roman" w:hAnsi="Times New Roman"/>
-          <w:b/>
-          <w:bCs/>
-          <w:sz w:val="20"/>
-          <w:lang w:val="en-US"/>
-        </w:rPr>
-      </w:pPr>
-      <w:r>
-        <w:rPr>
-          <w:rFonts w:ascii="Times New Roman" w:hAnsi="Times New Roman"/>
-          <w:b/>
-          <w:bCs/>
-          <w:sz w:val="20"/>
-          <w:lang w:val="en-US"/>
-        </w:rPr>
-        <w:t xml:space="preserve">Lr. No:     </w:t>
-      </w:r>
-      <w:r>
-        <w:rPr>
-          <w:rFonts w:ascii="Times New Roman" w:hAnsi="Times New Roman"/>
-          <w:b/>
-          <w:bCs/>
-          <w:sz w:val="20"/>
-          <w:lang w:val="en-US"/>
-        </w:rPr>
-        <w:t xml:space="preserve">     /EE/</w:t>
-      </w:r>
-      <w:r>
-        <w:rPr>
-          <w:rFonts w:ascii="Times New Roman" w:hAnsi="Times New Roman"/>
-          <w:b/>
-          <w:bCs/>
-        </w:rPr>
-        <w:t>NIZAMPET/CIR-58</w:t>
-      </w:r>
-      <w:r>
-        <w:rPr>
-          <w:rFonts w:ascii="Times New Roman" w:hAnsi="Times New Roman"/>
-          <w:b/>
-          <w:bCs/>
-        </w:rPr>
-        <w:t>/</w:t>
-      </w:r>
-      <w:r>
-        <w:rPr>
-          <w:rFonts w:ascii="Times New Roman" w:hAnsi="Times New Roman"/>
-          <w:b/>
-          <w:bCs/>
-        </w:rPr>
-        <w:t>QBZ/CMC</w:t>
-      </w:r>
-      <w:r>
-        <w:rPr>
-          <w:rFonts w:ascii="Times New Roman" w:hAnsi="Times New Roman"/>
-          <w:b/>
-          <w:bCs/>
-        </w:rPr>
-        <w:t>/202</w:t>
-      </w:r>
-      <w:r>
-        <w:rPr>
-          <w:rFonts w:ascii="Times New Roman" w:hAnsi="Times New Roman"/>
-          <w:b/>
-          <w:bCs/>
-        </w:rPr>
-        <w:t>6</w:t>
-      </w:r>
-      <w:r>
-        <w:rPr>
-          <w:rFonts w:ascii="Times New Roman" w:hAnsi="Times New Roman"/>
-          <w:b/>
-          <w:bCs/>
-        </w:rPr>
-        <w:t>-2</w:t>
-      </w:r>
-      <w:r>
-        <w:rPr>
-          <w:rFonts w:ascii="Times New Roman" w:hAnsi="Times New Roman"/>
-          <w:b/>
-          <w:bCs/>
-        </w:rPr>
-        <w:t>7</w:t>
-      </w:r>
-      <w:r>
-        <w:rPr>
-          <w:rFonts w:ascii="Times New Roman" w:hAnsi="Times New Roman"/>
-          <w:b/>
-          <w:bCs/>
-          <w:sz w:val="20"/>
-          <w:lang w:val="en-US"/>
-        </w:rPr>
-        <w:tab/>
-      </w:r>
-      <w:r>
-        <w:rPr>
-          <w:rFonts w:ascii="Times New Roman" w:hAnsi="Times New Roman"/>
-          <w:b/>
-          <w:bCs/>
-          <w:sz w:val="20"/>
-          <w:lang w:val="en-US"/>
-        </w:rPr>
-        <w:tab/>
-        <w:t xml:space="preserve">                   Date:</w:t>
-      </w:r>
-      <w:r>
-        <w:rPr>
-          <w:rFonts w:ascii="Times New Roman" w:hAnsi="Times New Roman"/>
-          <w:b/>
-          <w:bCs/>
-          <w:sz w:val="20"/>
-          <w:lang w:val="en-US"/>
-        </w:rPr>
-        <w:t>24</w:t>
-      </w:r>
-      <w:r>
-        <w:rPr>
-          <w:rFonts w:ascii="Times New Roman" w:hAnsi="Times New Roman"/>
-          <w:b/>
-          <w:bCs/>
-          <w:sz w:val="20"/>
-          <w:lang w:val="en-US"/>
-        </w:rPr>
-        <w:t>.07.2026</w:t>
-      </w:r>
-    </w:p>
-    <w:p>
-      <w:pPr>
-        <w:pStyle w:val="NoSpacing"/>
-        <w:jc w:val="both"/>
-        <w:rPr>
-          <w:rFonts w:ascii="Times New Roman" w:hAnsi="Times New Roman"/>
           <w:sz w:val="20"/>
           <w:lang w:val="en-US"/>
         </w:rPr>
@@ -478,9 +518,69 @@
         <w:rPr>
           <w:noProof/>
         </w:rPr>
-        <w:pict w14:anchorId="6BF5D77E">
-          <v:line id="Straight Connector 4" o:spid="_x0000_s1026" style="position:absolute;left:0;text-align:left;z-index:251660288;visibility:visible;mso-wrap-style:square;mso-width-percent:0;mso-height-percent:0;mso-wrap-distance-left:9pt;mso-wrap-distance-top:.omm;mso-wrap-distance-right:9pt;mso-wrap-distance-bottom:.omm;mso-position-horizontal:absolute;mso-position-horizontal-relative:text;mso-position-vertical:absolute;mso-position-vertical-relative:text;mso-width-percent:0;mso-height-percent:0;mso-width-relative:page;mso-height-relative:page" from="-3.75pt,2.85pt" to="453.75pt,2.85pt" o:gfxdata="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" strokeweight="1.5pt"/>
-        </w:pict>
+        <mc:AlternateContent>
+          <mc:Choice Requires="wps">
+            <w:drawing>
+              <wp:anchor distT="4294967295" distB="4294967295" distL="114300" distR="114300" simplePos="0" relativeHeight="251659264" behindDoc="0" locked="0" layoutInCell="1" allowOverlap="1" wp14:anchorId="142ADE9B" wp14:editId="4BAA9D60">
+                <wp:simplePos x="0" y="0"/>
+                <wp:positionH relativeFrom="column">
+                  <wp:posOffset>-47625</wp:posOffset>
+                </wp:positionH>
+                <wp:positionV relativeFrom="paragraph">
+                  <wp:posOffset>36194</wp:posOffset>
+                </wp:positionV>
+                <wp:extent cx="5810250" cy="0"/>
+                <wp:effectExtent l="0" t="12700" r="6350" b="0"/>
+                <wp:wrapNone/>
+                <wp:docPr id="1300797169" name="Straight Connector 1"/>
+                <wp:cNvGraphicFramePr>
+                  <a:graphicFrameLocks xmlns:a="http://schemas.openxmlformats.org/drawingml/2006/main"/>
+                </wp:cNvGraphicFramePr>
+                <a:graphic xmlns:a="http://schemas.openxmlformats.org/drawingml/2006/main">
+                  <a:graphicData uri="http://schemas.microsoft.com/office/word/2010/wordprocessingShape">
+                    <wps:wsp>
+                      <wps:cNvCnPr>
+                        <a:cxnSpLocks/>
+                      </wps:cNvCnPr>
+                      <wps:spPr bwMode="auto">
+                        <a:xfrm>
+                          <a:off x="0" y="0"/>
+                          <a:ext cx="5810250" cy="0"/>
+                        </a:xfrm>
+                        <a:prstGeom prst="line">
+                          <a:avLst/>
+                        </a:prstGeom>
+                        <a:noFill/>
+                        <a:ln w="19050">
+                          <a:solidFill>
+                            <a:srgbClr val="000000"/>
+                          </a:solidFill>
+                          <a:round/>
+                          <a:headEnd/>
+                          <a:tailEnd/>
+                        </a:ln>
+                      </wps:spPr>
+                      <wps:bodyPr/>
+                    </wps:wsp>
+                  </a:graphicData>
+                </a:graphic>
+                <wp14:sizeRelH relativeFrom="page">
+                  <wp14:pctWidth>0</wp14:pctWidth>
+                </wp14:sizeRelH>
+                <wp14:sizeRelV relativeFrom="page">
+                  <wp14:pctHeight>0</wp14:pctHeight>
+                </wp14:sizeRelV>
+              </wp:anchor>
+            </w:drawing>
+          </mc:Choice>
+          <mc:Fallback>
+            <w:pict>
+              <v:line w14:anchorId="0A34928B" id="Straight Connector 1" o:spid="_x0000_s1026" style="position:absolute;z-index:251659264;visibility:visible;mso-wrap-style:square;mso-width-percent:0;mso-height-percent:0;mso-wrap-distance-left:9pt;mso-wrap-distance-top:.rmm;mso-wrap-distance-right:9pt;mso-wrap-distance-bottom:.rmm;mso-position-horizontal:absolute;mso-position-horizontal-relative:text;mso-position-vertical:absolute;mso-position-vertical-relative:text;mso-width-percent:0;mso-height-percent:0;mso-width-relative:page;mso-height-relative:page" from="-3.75pt,2.85pt" to="453.75pt,2.85pt" o:gfxdata="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" strokeweight="1.5pt">
+                <o:lock v:ext="edit" shapetype="f"/>
+              </v:line>
+            </w:pict>
+          </mc:Fallback>
+        </mc:AlternateContent>
       </w:r>
     </w:p>
     <w:p>
@@ -595,16 +695,7 @@
           <w:szCs w:val="22"/>
           <w:lang w:val="en-US"/>
         </w:rPr>
-        <w:t xml:space="preserve">Phone No: </w:t>
-      </w:r>
-      <w:r>
-        <w:rPr>
-          <w:rFonts w:ascii="Book Antiqua" w:hAnsi="Book Antiqua"/>
-          <w:sz w:val="20"/>
-          <w:szCs w:val="22"/>
-          <w:lang w:val="en-US"/>
-        </w:rPr>
-        <w:t>{{agency phone number}}</w:t>
+        <w:t>Phone No: {{agency phone number}}</w:t>
       </w:r>
     </w:p>
     <w:p>
@@ -669,7 +760,14 @@
                 <w:sz w:val="22"/>
                 <w:szCs w:val="22"/>
               </w:rPr>
-              <w:t xml:space="preserve">Quthbullapur Zone </w:t>
+              <w:t>{{Zone}}</w:t>
+            </w:r>
+            <w:r>
+              <w:rPr>
+                <w:sz w:val="22"/>
+                <w:szCs w:val="22"/>
+              </w:rPr>
+              <w:t xml:space="preserve"> Zone </w:t>
             </w:r>
             <w:r>
               <w:rPr>
@@ -697,7 +795,21 @@
                 <w:sz w:val="22"/>
                 <w:szCs w:val="22"/>
               </w:rPr>
-              <w:t xml:space="preserve"> – Circle-58 –Works “</w:t>
+              <w:t xml:space="preserve"> – Circle-</w:t>
+            </w:r>
+            <w:r>
+              <w:rPr>
+                <w:sz w:val="22"/>
+                <w:szCs w:val="22"/>
+              </w:rPr>
+              <w:t>{{CNO}}</w:t>
+            </w:r>
+            <w:r>
+              <w:rPr>
+                <w:sz w:val="22"/>
+                <w:szCs w:val="22"/>
+              </w:rPr>
+              <w:t xml:space="preserve"> –Works “</w:t>
             </w:r>
             <w:r>
               <w:rPr>
@@ -705,8 +817,9 @@
                 <w:sz w:val="22"/>
                 <w:szCs w:val="22"/>
               </w:rPr>
-              <w:t>{{Name of the agency}}</w:t>
+              <w:t>{{Name of the work}}</w:t>
             </w:r>
+            <w:proofErr w:type="gramStart"/>
             <w:r>
               <w:rPr>
                 <w:bCs/>
@@ -720,7 +833,15 @@
                 <w:sz w:val="22"/>
                 <w:szCs w:val="22"/>
               </w:rPr>
-              <w:t>– Letter of Acceptance – Issued –Reg.</w:t>
+              <w:t>–</w:t>
+            </w:r>
+            <w:proofErr w:type="gramEnd"/>
+            <w:r>
+              <w:rPr>
+                <w:sz w:val="22"/>
+                <w:szCs w:val="22"/>
+              </w:rPr>
+              <w:t xml:space="preserve"> Letter of Acceptance – Issued –Reg.</w:t>
             </w:r>
           </w:p>
           <w:p>
@@ -813,7 +934,7 @@
           <w:szCs w:val="20"/>
           <w:lang w:val="en-US"/>
         </w:rPr>
-        <w:t>24.07.2026</w:t>
+        <w:t>{{Price Bid opening date}}</w:t>
       </w:r>
     </w:p>
     <w:p>
@@ -827,6 +948,7 @@
           <w:szCs w:val="20"/>
         </w:rPr>
       </w:pPr>
+      <w:proofErr w:type="gramStart"/>
       <w:r>
         <w:rPr>
           <w:rFonts w:ascii="Times New Roman" w:hAnsi="Times New Roman"/>
@@ -836,8 +958,9 @@
           <w:szCs w:val="20"/>
           <w:lang w:val="en-US"/>
         </w:rPr>
-        <w:t xml:space="preserve">3).Amount of Estimate: </w:t>
-      </w:r>
+        <w:t>3).Amount</w:t>
+      </w:r>
+      <w:proofErr w:type="gramEnd"/>
       <w:r>
         <w:rPr>
           <w:rFonts w:ascii="Times New Roman" w:hAnsi="Times New Roman"/>
@@ -847,29 +970,7 @@
           <w:szCs w:val="20"/>
           <w:lang w:val="en-US"/>
         </w:rPr>
-        <w:t>Rs.</w:t>
-      </w:r>
-      <w:r>
-        <w:rPr>
-          <w:rFonts w:ascii="Times New Roman" w:hAnsi="Times New Roman"/>
-          <w:b/>
-          <w:bCs/>
-          <w:sz w:val="18"/>
-          <w:szCs w:val="20"/>
-          <w:lang w:val="en-US"/>
-        </w:rPr>
-        <w:t xml:space="preserve">5.00 </w:t>
-      </w:r>
-      <w:r>
-        <w:rPr>
-          <w:rFonts w:ascii="Times New Roman" w:hAnsi="Times New Roman"/>
-          <w:b/>
-          <w:bCs/>
-          <w:sz w:val="18"/>
-          <w:szCs w:val="20"/>
-          <w:lang w:val="en-US"/>
-        </w:rPr>
-        <w:t>Lakhs</w:t>
+        <w:t xml:space="preserve"> of Estimate: {{Estimate Amount}}</w:t>
       </w:r>
     </w:p>
     <w:p>
@@ -953,7 +1054,27 @@
           <w:sz w:val="22"/>
           <w:szCs w:val="22"/>
         </w:rPr>
-        <w:t>{{Tender Pencentage}}</w:t>
+        <w:t xml:space="preserve">{{Tender </w:t>
+      </w:r>
+      <w:proofErr w:type="spellStart"/>
+      <w:r>
+        <w:rPr>
+          <w:b/>
+          <w:bCs/>
+          <w:sz w:val="22"/>
+          <w:szCs w:val="22"/>
+        </w:rPr>
+        <w:t>Pencentage</w:t>
+      </w:r>
+      <w:proofErr w:type="spellEnd"/>
+      <w:r>
+        <w:rPr>
+          <w:b/>
+          <w:bCs/>
+          <w:sz w:val="22"/>
+          <w:szCs w:val="22"/>
+        </w:rPr>
+        <w:t>}}</w:t>
       </w:r>
       <w:r>
         <w:rPr>
@@ -1121,6 +1242,7 @@
         </w:rPr>
         <w:t xml:space="preserve">If you are failed to conclude the agreement within the </w:t>
       </w:r>
+      <w:proofErr w:type="gramStart"/>
       <w:r>
         <w:rPr>
           <w:rFonts w:ascii="Times New Roman" w:hAnsi="Times New Roman"/>
@@ -1132,6 +1254,7 @@
         </w:rPr>
         <w:t>(  07  )</w:t>
       </w:r>
+      <w:proofErr w:type="gramEnd"/>
       <w:r>
         <w:rPr>
           <w:rFonts w:ascii="Times New Roman" w:hAnsi="Times New Roman"/>
@@ -1157,14 +1280,25 @@
           <w:lang w:val="en-US"/>
         </w:rPr>
       </w:pPr>
-      <w:r>
-        <w:rPr>
-          <w:rFonts w:ascii="Times New Roman" w:hAnsi="Times New Roman"/>
-          <w:sz w:val="20"/>
-          <w:szCs w:val="20"/>
-          <w:lang w:val="en-US"/>
-        </w:rPr>
-        <w:t xml:space="preserve">If CC road, MOU with RMC Plant with Last Six Months QCI Certificate Approved and Design Mix Copy as per the specifications should be submitted. </w:t>
+      <w:proofErr w:type="gramStart"/>
+      <w:r>
+        <w:rPr>
+          <w:rFonts w:ascii="Times New Roman" w:hAnsi="Times New Roman"/>
+          <w:sz w:val="20"/>
+          <w:szCs w:val="20"/>
+          <w:lang w:val="en-US"/>
+        </w:rPr>
+        <w:t>If CC road</w:t>
+      </w:r>
+      <w:proofErr w:type="gramEnd"/>
+      <w:r>
+        <w:rPr>
+          <w:rFonts w:ascii="Times New Roman" w:hAnsi="Times New Roman"/>
+          <w:sz w:val="20"/>
+          <w:szCs w:val="20"/>
+          <w:lang w:val="en-US"/>
+        </w:rPr>
+        <w:t xml:space="preserve">, MOU with RMC Plant with Last Six Months QCI Certificate Approved and Design Mix Copy as per the specifications should be submitted. </w:t>
       </w:r>
     </w:p>
     <w:p>
@@ -1203,7 +1337,7 @@
           <w:szCs w:val="20"/>
           <w:lang w:val="en-US"/>
         </w:rPr>
-        <w:t xml:space="preserve">(Rs. </w:t>
+        <w:t>(</w:t>
       </w:r>
       <w:r>
         <w:rPr>
@@ -1215,8 +1349,9 @@
           <w:szCs w:val="20"/>
           <w:lang w:val="en-US"/>
         </w:rPr>
-        <w:t>1 ½ Rs.</w:t>
-      </w:r>
+        <w:t>{{EMD 1.5%}</w:t>
+      </w:r>
+      <w:proofErr w:type="gramStart"/>
       <w:r>
         <w:rPr>
           <w:rFonts w:ascii="Times New Roman" w:hAnsi="Times New Roman"/>
@@ -1227,8 +1362,9 @@
           <w:szCs w:val="20"/>
           <w:lang w:val="en-US"/>
         </w:rPr>
-        <w:t>{{EMD}}</w:t>
-      </w:r>
+        <w:t>}</w:t>
+      </w:r>
+      <w:proofErr w:type="gramEnd"/>
       <w:r>
         <w:rPr>
           <w:rFonts w:ascii="Times New Roman" w:hAnsi="Times New Roman"/>
@@ -1239,19 +1375,7 @@
           <w:szCs w:val="20"/>
           <w:lang w:val="en-US"/>
         </w:rPr>
-        <w:t>/-</w:t>
-      </w:r>
-      <w:r>
-        <w:rPr>
-          <w:rFonts w:ascii="Times New Roman" w:hAnsi="Times New Roman"/>
-          <w:b/>
-          <w:bCs/>
-          <w:color w:val="FF0000"/>
-          <w:sz w:val="20"/>
-          <w:szCs w:val="20"/>
-          <w:lang w:val="en-US"/>
-        </w:rPr>
-        <w:t>,{{ASD}}</w:t>
+        <w:t/>
       </w:r>
       <w:r>
         <w:rPr>
@@ -1524,169 +1648,195 @@
     <w:p>
       <w:pPr>
         <w:pStyle w:val="NoSpacing"/>
-        <w:jc w:val="both"/>
-        <w:rPr>
-          <w:rFonts w:ascii="Times New Roman" w:hAnsi="Times New Roman"/>
-          <w:b/>
-          <w:sz w:val="20"/>
-          <w:szCs w:val="20"/>
-          <w:lang w:val="en-US"/>
-        </w:rPr>
-      </w:pPr>
-      <w:r>
-        <w:rPr>
-          <w:rFonts w:ascii="Times New Roman" w:hAnsi="Times New Roman"/>
-          <w:b/>
-          <w:sz w:val="20"/>
-          <w:szCs w:val="20"/>
-          <w:lang w:val="en-US"/>
-        </w:rPr>
-        <w:tab/>
-      </w:r>
-      <w:r>
-        <w:rPr>
-          <w:rFonts w:ascii="Times New Roman" w:hAnsi="Times New Roman"/>
-          <w:b/>
-          <w:sz w:val="20"/>
-          <w:szCs w:val="20"/>
-          <w:lang w:val="en-US"/>
-        </w:rPr>
-        <w:tab/>
-      </w:r>
-      <w:r>
-        <w:rPr>
-          <w:rFonts w:ascii="Times New Roman" w:hAnsi="Times New Roman"/>
-          <w:b/>
-          <w:sz w:val="20"/>
-          <w:szCs w:val="20"/>
-          <w:lang w:val="en-US"/>
-        </w:rPr>
-        <w:tab/>
-      </w:r>
-      <w:r>
-        <w:rPr>
-          <w:rFonts w:ascii="Times New Roman" w:hAnsi="Times New Roman"/>
-          <w:b/>
-          <w:sz w:val="20"/>
-          <w:szCs w:val="20"/>
-          <w:lang w:val="en-US"/>
-        </w:rPr>
-        <w:tab/>
-      </w:r>
-      <w:r>
-        <w:rPr>
-          <w:rFonts w:ascii="Times New Roman" w:hAnsi="Times New Roman"/>
-          <w:b/>
-          <w:sz w:val="20"/>
-          <w:szCs w:val="20"/>
-          <w:lang w:val="en-US"/>
-        </w:rPr>
-        <w:tab/>
-      </w:r>
-      <w:r>
-        <w:rPr>
-          <w:rFonts w:ascii="Times New Roman" w:hAnsi="Times New Roman"/>
-          <w:b/>
-          <w:sz w:val="20"/>
-          <w:szCs w:val="20"/>
-          <w:lang w:val="en-US"/>
-        </w:rPr>
-        <w:tab/>
-      </w:r>
-      <w:r>
-        <w:rPr>
-          <w:rFonts w:ascii="Times New Roman" w:hAnsi="Times New Roman"/>
-          <w:b/>
-          <w:sz w:val="20"/>
-          <w:szCs w:val="20"/>
-          <w:lang w:val="en-US"/>
-        </w:rPr>
-        <w:tab/>
-        <w:t xml:space="preserve">                   Executive Engineer</w:t>
+        <w:jc w:val="right"/>
+        <w:rPr>
+          <w:rFonts w:ascii="Times New Roman" w:hAnsi="Times New Roman"/>
+          <w:b/>
+          <w:sz w:val="20"/>
+          <w:szCs w:val="20"/>
+          <w:lang w:val="en-US"/>
+        </w:rPr>
+      </w:pPr>
+      <w:r>
+        <w:rPr>
+          <w:rFonts w:ascii="Times New Roman" w:hAnsi="Times New Roman"/>
+          <w:b/>
+          <w:sz w:val="20"/>
+          <w:szCs w:val="20"/>
+          <w:lang w:val="en-US"/>
+        </w:rPr>
+      </w:r>
+      <w:r>
+        <w:rPr>
+          <w:rFonts w:ascii="Times New Roman" w:hAnsi="Times New Roman"/>
+          <w:b/>
+          <w:sz w:val="20"/>
+          <w:szCs w:val="20"/>
+          <w:lang w:val="en-US"/>
+        </w:rPr>
+      </w:r>
+      <w:r>
+        <w:rPr>
+          <w:rFonts w:ascii="Times New Roman" w:hAnsi="Times New Roman"/>
+          <w:b/>
+          <w:sz w:val="20"/>
+          <w:szCs w:val="20"/>
+          <w:lang w:val="en-US"/>
+        </w:rPr>
+      </w:r>
+      <w:r>
+        <w:rPr>
+          <w:rFonts w:ascii="Times New Roman" w:hAnsi="Times New Roman"/>
+          <w:b/>
+          <w:sz w:val="20"/>
+          <w:szCs w:val="20"/>
+          <w:lang w:val="en-US"/>
+        </w:rPr>
+      </w:r>
+      <w:r>
+        <w:rPr>
+          <w:rFonts w:ascii="Times New Roman" w:hAnsi="Times New Roman"/>
+          <w:b/>
+          <w:sz w:val="20"/>
+          <w:szCs w:val="20"/>
+          <w:lang w:val="en-US"/>
+        </w:rPr>
+      </w:r>
+      <w:r>
+        <w:rPr>
+          <w:rFonts w:ascii="Times New Roman" w:hAnsi="Times New Roman"/>
+          <w:b/>
+          <w:sz w:val="20"/>
+          <w:szCs w:val="20"/>
+          <w:lang w:val="en-US"/>
+        </w:rPr>
+      </w:r>
+      <w:r>
+        <w:rPr>
+          <w:rFonts w:ascii="Times New Roman" w:hAnsi="Times New Roman"/>
+          <w:b/>
+          <w:sz w:val="20"/>
+          <w:szCs w:val="20"/>
+          <w:lang w:val="en-US"/>
+        </w:rPr>
+        <w:t xml:space="preserve">Executive Engineer</w:t>
       </w:r>
     </w:p>
     <w:p>
       <w:pPr>
         <w:pStyle w:val="NoSpacing"/>
-        <w:jc w:val="both"/>
-        <w:rPr>
-          <w:rFonts w:ascii="Times New Roman" w:hAnsi="Times New Roman"/>
-          <w:b/>
-          <w:sz w:val="20"/>
-          <w:szCs w:val="20"/>
-          <w:lang w:val="en-US"/>
-        </w:rPr>
-      </w:pPr>
-      <w:r>
-        <w:rPr>
-          <w:rFonts w:ascii="Times New Roman" w:hAnsi="Times New Roman"/>
-          <w:b/>
-          <w:sz w:val="20"/>
-          <w:szCs w:val="20"/>
-          <w:lang w:val="en-US"/>
-        </w:rPr>
-        <w:tab/>
-      </w:r>
-      <w:r>
-        <w:rPr>
-          <w:rFonts w:ascii="Times New Roman" w:hAnsi="Times New Roman"/>
-          <w:b/>
-          <w:sz w:val="20"/>
-          <w:szCs w:val="20"/>
-          <w:lang w:val="en-US"/>
-        </w:rPr>
-        <w:tab/>
-      </w:r>
-      <w:r>
-        <w:rPr>
-          <w:rFonts w:ascii="Times New Roman" w:hAnsi="Times New Roman"/>
-          <w:b/>
-          <w:sz w:val="20"/>
-          <w:szCs w:val="20"/>
-          <w:lang w:val="en-US"/>
-        </w:rPr>
-        <w:tab/>
-      </w:r>
-      <w:r>
-        <w:rPr>
-          <w:rFonts w:ascii="Times New Roman" w:hAnsi="Times New Roman"/>
-          <w:b/>
-          <w:sz w:val="20"/>
-          <w:szCs w:val="20"/>
-          <w:lang w:val="en-US"/>
-        </w:rPr>
-        <w:tab/>
-      </w:r>
-      <w:r>
-        <w:rPr>
-          <w:rFonts w:ascii="Times New Roman" w:hAnsi="Times New Roman"/>
-          <w:b/>
-          <w:sz w:val="20"/>
-          <w:szCs w:val="20"/>
-          <w:lang w:val="en-US"/>
-        </w:rPr>
-        <w:tab/>
-      </w:r>
-      <w:r>
-        <w:rPr>
-          <w:rFonts w:ascii="Times New Roman" w:hAnsi="Times New Roman"/>
-          <w:b/>
-          <w:sz w:val="20"/>
-          <w:szCs w:val="20"/>
-          <w:lang w:val="en-US"/>
-        </w:rPr>
-        <w:tab/>
-      </w:r>
-      <w:r>
-        <w:rPr>
-          <w:rFonts w:ascii="Times New Roman" w:hAnsi="Times New Roman"/>
-          <w:b/>
-          <w:sz w:val="20"/>
-          <w:szCs w:val="20"/>
-          <w:lang w:val="en-US"/>
-        </w:rPr>
-        <w:tab/>
-        <w:t xml:space="preserve">            Nizampet Circle-58, CMC</w:t>
+        <w:jc w:val="right"/>
+        <w:rPr>
+          <w:rFonts w:ascii="Times New Roman" w:hAnsi="Times New Roman"/>
+          <w:b/>
+          <w:sz w:val="20"/>
+          <w:szCs w:val="20"/>
+          <w:lang w:val="en-US"/>
+        </w:rPr>
+      </w:pPr>
+      <w:r>
+        <w:rPr>
+          <w:rFonts w:ascii="Times New Roman" w:hAnsi="Times New Roman"/>
+          <w:b/>
+          <w:sz w:val="20"/>
+          <w:szCs w:val="20"/>
+          <w:lang w:val="en-US"/>
+        </w:rPr>
+      </w:r>
+      <w:r>
+        <w:rPr>
+          <w:rFonts w:ascii="Times New Roman" w:hAnsi="Times New Roman"/>
+          <w:b/>
+          <w:sz w:val="20"/>
+          <w:szCs w:val="20"/>
+          <w:lang w:val="en-US"/>
+        </w:rPr>
+      </w:r>
+      <w:r>
+        <w:rPr>
+          <w:rFonts w:ascii="Times New Roman" w:hAnsi="Times New Roman"/>
+          <w:b/>
+          <w:sz w:val="20"/>
+          <w:szCs w:val="20"/>
+          <w:lang w:val="en-US"/>
+        </w:rPr>
+      </w:r>
+      <w:r>
+        <w:rPr>
+          <w:rFonts w:ascii="Times New Roman" w:hAnsi="Times New Roman"/>
+          <w:b/>
+          <w:sz w:val="20"/>
+          <w:szCs w:val="20"/>
+          <w:lang w:val="en-US"/>
+        </w:rPr>
+      </w:r>
+      <w:r>
+        <w:rPr>
+          <w:rFonts w:ascii="Times New Roman" w:hAnsi="Times New Roman"/>
+          <w:b/>
+          <w:sz w:val="20"/>
+          <w:szCs w:val="20"/>
+          <w:lang w:val="en-US"/>
+        </w:rPr>
+      </w:r>
+      <w:r>
+        <w:rPr>
+          <w:rFonts w:ascii="Times New Roman" w:hAnsi="Times New Roman"/>
+          <w:b/>
+          <w:sz w:val="20"/>
+          <w:szCs w:val="20"/>
+          <w:lang w:val="en-US"/>
+        </w:rPr>
+      </w:r>
+      <w:r>
+        <w:rPr>
+          <w:rFonts w:ascii="Times New Roman" w:hAnsi="Times New Roman"/>
+          <w:b/>
+          <w:sz w:val="20"/>
+          <w:szCs w:val="20"/>
+          <w:lang w:val="en-US"/>
+        </w:rPr>
+        <w:t xml:space="preserve"/>
+      </w:r>
+      <w:r>
+        <w:rPr>
+          <w:rFonts w:ascii="Times New Roman" w:hAnsi="Times New Roman"/>
+          <w:b/>
+          <w:sz w:val="20"/>
+          <w:szCs w:val="20"/>
+          <w:lang w:val="en-US"/>
+        </w:rPr>
+        <w:t>{{Circle}}</w:t>
+      </w:r>
+      <w:r>
+        <w:rPr>
+          <w:rFonts w:ascii="Times New Roman" w:hAnsi="Times New Roman"/>
+          <w:b/>
+          <w:sz w:val="20"/>
+          <w:szCs w:val="20"/>
+          <w:lang w:val="en-US"/>
+        </w:rPr>
+        <w:t xml:space="preserve"> Circle-</w:t>
+      </w:r>
+      <w:r>
+        <w:rPr>
+          <w:rFonts w:ascii="Times New Roman" w:hAnsi="Times New Roman"/>
+          <w:b/>
+          <w:sz w:val="20"/>
+          <w:szCs w:val="20"/>
+          <w:lang w:val="en-US"/>
+        </w:rPr>
+        <w:t>{{CNO}}</w:t>
+      </w:r>
+      <w:r>
+        <w:rPr>
+          <w:rFonts w:ascii="Times New Roman" w:hAnsi="Times New Roman"/>
+          <w:b/>
+          <w:sz w:val="20"/>
+          <w:szCs w:val="20"/>
+          <w:lang w:val="en-US"/>
+        </w:rPr>
+        <w:t>, CMC</w:t>
       </w:r>
     </w:p>
     <w:p>
@@ -1726,7 +1876,43 @@
           <w:szCs w:val="20"/>
           <w:lang w:val="en-US"/>
         </w:rPr>
-        <w:t>Copy to Dy. Executive Engineers of Nizampet Circle-58, CMC for information and necessary action.</w:t>
+        <w:t xml:space="preserve">Copy to Dy. Executive Engineers of </w:t>
+      </w:r>
+      <w:r>
+        <w:rPr>
+          <w:rFonts w:ascii="Times New Roman" w:hAnsi="Times New Roman"/>
+          <w:sz w:val="20"/>
+          <w:szCs w:val="20"/>
+          <w:lang w:val="en-US"/>
+        </w:rPr>
+        <w:t>{{Circle}}</w:t>
+      </w:r>
+      <w:r>
+        <w:rPr>
+          <w:rFonts w:ascii="Times New Roman" w:hAnsi="Times New Roman"/>
+          <w:sz w:val="20"/>
+          <w:szCs w:val="20"/>
+          <w:lang w:val="en-US"/>
+        </w:rPr>
+        <w:t xml:space="preserve"> Circle-</w:t>
+      </w:r>
+      <w:r>
+        <w:rPr>
+          <w:rFonts w:ascii="Times New Roman" w:hAnsi="Times New Roman"/>
+          <w:sz w:val="20"/>
+          <w:szCs w:val="20"/>
+          <w:lang w:val="en-US"/>
+        </w:rPr>
+        <w:t>{{CNO}}</w:t>
+      </w:r>
+      <w:r>
+        <w:rPr>
+          <w:rFonts w:ascii="Times New Roman" w:hAnsi="Times New Roman"/>
+          <w:sz w:val="20"/>
+          <w:szCs w:val="20"/>
+          <w:lang w:val="en-US"/>
+        </w:rPr>
+        <w:t>, CMC for information and necessary action.</w:t>
       </w:r>
     </w:p>
     <w:p>
@@ -1751,7 +1937,63 @@
           <w:szCs w:val="20"/>
           <w:lang w:val="en-US"/>
         </w:rPr>
-        <w:t>Copy to Asst. Executive Engineers / Asst Engineer of  Nizampet Circle-58, CMC</w:t>
+        <w:t xml:space="preserve">Copy to Asst. Executive Engineers / Asst Engineer </w:t>
+      </w:r>
+      <w:proofErr w:type="gramStart"/>
+      <w:r>
+        <w:rPr>
+          <w:rFonts w:ascii="Times New Roman" w:hAnsi="Times New Roman"/>
+          <w:sz w:val="20"/>
+          <w:szCs w:val="20"/>
+          <w:lang w:val="en-US"/>
+        </w:rPr>
+        <w:t xml:space="preserve">of  </w:t>
+      </w:r>
+      <w:r>
+        <w:rPr>
+          <w:rFonts w:ascii="Times New Roman" w:hAnsi="Times New Roman"/>
+          <w:sz w:val="20"/>
+          <w:szCs w:val="20"/>
+          <w:lang w:val="en-US"/>
+        </w:rPr>
+        <w:t>{</w:t>
+      </w:r>
+      <w:proofErr w:type="gramEnd"/>
+      <w:r>
+        <w:rPr>
+          <w:rFonts w:ascii="Times New Roman" w:hAnsi="Times New Roman"/>
+          <w:sz w:val="20"/>
+          <w:szCs w:val="20"/>
+          <w:lang w:val="en-US"/>
+        </w:rPr>
+        <w:t>{Circle}}</w:t>
+      </w:r>
+      <w:r>
+        <w:rPr>
+          <w:rFonts w:ascii="Times New Roman" w:hAnsi="Times New Roman"/>
+          <w:sz w:val="20"/>
+          <w:szCs w:val="20"/>
+          <w:lang w:val="en-US"/>
+        </w:rPr>
+        <w:t xml:space="preserve"> Circle-</w:t>
+      </w:r>
+      <w:r>
+        <w:rPr>
+          <w:rFonts w:ascii="Times New Roman" w:hAnsi="Times New Roman"/>
+          <w:sz w:val="20"/>
+          <w:szCs w:val="20"/>
+          <w:lang w:val="en-US"/>
+        </w:rPr>
+        <w:t>{{CNO}}</w:t>
+      </w:r>
+      <w:r>
+        <w:rPr>
+          <w:rFonts w:ascii="Times New Roman" w:hAnsi="Times New Roman"/>
+          <w:sz w:val="20"/>
+          <w:szCs w:val="20"/>
+          <w:lang w:val="en-US"/>
+        </w:rPr>
+        <w:t>, CMC</w:t>
       </w:r>
     </w:p>
     <w:p>
@@ -1775,6 +2017,7 @@
         </w:rPr>
       </w:pPr>
     </w:p>
+    <w:p/>
     <w:sectPr>
       <w:pgSz w:w="12240" w:h="15840"/>
       <w:pgMar w:top="568" w:right="1440" w:bottom="1440" w:left="1440" w:header="708" w:footer="708" w:gutter="0"/>
@@ -2004,14 +2247,16 @@
     <w:rPrDefault>
       <w:rPr>
         <w:rFonts w:asciiTheme="minorHAnsi" w:eastAsiaTheme="minorHAnsi" w:hAnsiTheme="minorHAnsi" w:cstheme="minorBidi"/>
-        <w:sz w:val="22"/>
-        <w:szCs w:val="22"/>
-        <w:lang w:val="en-US" w:eastAsia="en-US" w:bidi="te-IN"/>
+        <w:kern w:val="2"/>
+        <w:sz w:val="24"/>
+        <w:szCs w:val="24"/>
+        <w:lang w:val="en-IN" w:eastAsia="en-US" w:bidi="ar-SA"/>
+        <w14:ligatures w14:val="standardContextual"/>
       </w:rPr>
     </w:rPrDefault>
     <w:pPrDefault>
       <w:pPr>
-        <w:spacing w:after="200" w:line="276" w:lineRule="auto"/>
+        <w:spacing w:after="160" w:line="278" w:lineRule="auto"/>
       </w:pPr>
     </w:pPrDefault>
   </w:docDefaults>
@@ -2170,7 +2415,7 @@
     <w:lsdException w:name="Table Web 2" w:semiHidden="1" w:unhideWhenUsed="1"/>
     <w:lsdException w:name="Table Web 3" w:semiHidden="1" w:unhideWhenUsed="1"/>
     <w:lsdException w:name="Balloon Text" w:semiHidden="1" w:unhideWhenUsed="1"/>
-    <w:lsdException w:name="Table Grid" w:uiPriority="59"/>
+    <w:lsdException w:name="Table Grid" w:uiPriority="39"/>
     <w:lsdException w:name="Table Theme" w:semiHidden="1" w:unhideWhenUsed="1"/>
     <w:lsdException w:name="Placeholder Text" w:semiHidden="1"/>
     <w:lsdException w:name="No Spacing" w:uiPriority="1" w:qFormat="1"/>
@@ -2396,15 +2641,212 @@
   <w:style w:type="paragraph" w:default="1" w:styleId="Normal">
     <w:name w:val="Normal"/>
     <w:qFormat/>
-    <w:rsid w:val="000A7960"/>
+    <w:rsid w:val="00712111"/>
     <w:pPr>
       <w:spacing w:after="0" w:line="240" w:lineRule="auto"/>
     </w:pPr>
     <w:rPr>
       <w:rFonts w:ascii="Times New Roman" w:eastAsia="Times New Roman" w:hAnsi="Times New Roman" w:cs="Times New Roman"/>
-      <w:sz w:val="24"/>
-      <w:szCs w:val="24"/>
-      <w:lang w:bidi="ar-SA"/>
+      <w:kern w:val="0"/>
+      <w:lang w:val="en-US"/>
+      <w14:ligatures w14:val="none"/>
+    </w:rPr>
+  </w:style>
+  <w:style w:type="paragraph" w:styleId="Heading1">
+    <w:name w:val="heading 1"/>
+    <w:basedOn w:val="Normal"/>
+    <w:next w:val="Normal"/>
+    <w:link w:val="Heading1Char"/>
+    <w:uiPriority w:val="9"/>
+    <w:qFormat/>
+    <w:rsid w:val="00712111"/>
+    <w:pPr>
+      <w:keepNext/>
+      <w:keepLines/>
+      <w:spacing w:before="360" w:after="80"/>
+      <w:outlineLvl w:val="0"/>
+    </w:pPr>
+    <w:rPr>
+      <w:rFonts w:asciiTheme="majorHAnsi" w:eastAsiaTheme="majorEastAsia" w:hAnsiTheme="majorHAnsi" w:cstheme="majorBidi"/>
+      <w:color w:val="0F4761" w:themeColor="accent1" w:themeShade="BF"/>
+      <w:sz w:val="40"/>
+      <w:szCs w:val="40"/>
+    </w:rPr>
+  </w:style>
+  <w:style w:type="paragraph" w:styleId="Heading2">
+    <w:name w:val="heading 2"/>
+    <w:basedOn w:val="Normal"/>
+    <w:next w:val="Normal"/>
+    <w:link w:val="Heading2Char"/>
+    <w:uiPriority w:val="9"/>
+    <w:semiHidden/>
+    <w:unhideWhenUsed/>
+    <w:qFormat/>
+    <w:rsid w:val="00712111"/>
+    <w:pPr>
+      <w:keepNext/>
+      <w:keepLines/>
+      <w:spacing w:before="160" w:after="80"/>
+      <w:outlineLvl w:val="1"/>
+    </w:pPr>
+    <w:rPr>
+      <w:rFonts w:asciiTheme="majorHAnsi" w:eastAsiaTheme="majorEastAsia" w:hAnsiTheme="majorHAnsi" w:cstheme="majorBidi"/>
+      <w:color w:val="0F4761" w:themeColor="accent1" w:themeShade="BF"/>
+      <w:sz w:val="32"/>
+      <w:szCs w:val="32"/>
+    </w:rPr>
+  </w:style>
+  <w:style w:type="paragraph" w:styleId="Heading3">
+    <w:name w:val="heading 3"/>
+    <w:basedOn w:val="Normal"/>
+    <w:next w:val="Normal"/>
+    <w:link w:val="Heading3Char"/>
+    <w:uiPriority w:val="9"/>
+    <w:semiHidden/>
+    <w:unhideWhenUsed/>
+    <w:qFormat/>
+    <w:rsid w:val="00712111"/>
+    <w:pPr>
+      <w:keepNext/>
+      <w:keepLines/>
+      <w:spacing w:before="160" w:after="80"/>
+      <w:outlineLvl w:val="2"/>
+    </w:pPr>
+    <w:rPr>
+      <w:rFonts w:eastAsiaTheme="majorEastAsia" w:cstheme="majorBidi"/>
+      <w:color w:val="0F4761" w:themeColor="accent1" w:themeShade="BF"/>
+      <w:sz w:val="28"/>
+      <w:szCs w:val="28"/>
+    </w:rPr>
+  </w:style>
+  <w:style w:type="paragraph" w:styleId="Heading4">
+    <w:name w:val="heading 4"/>
+    <w:basedOn w:val="Normal"/>
+    <w:next w:val="Normal"/>
+    <w:link w:val="Heading4Char"/>
+    <w:uiPriority w:val="9"/>
+    <w:semiHidden/>
+    <w:unhideWhenUsed/>
+    <w:qFormat/>
+    <w:rsid w:val="00712111"/>
+    <w:pPr>
+      <w:keepNext/>
+      <w:keepLines/>
+      <w:spacing w:before="80" w:after="40"/>
+      <w:outlineLvl w:val="3"/>
+    </w:pPr>
+    <w:rPr>
+      <w:rFonts w:eastAsiaTheme="majorEastAsia" w:cstheme="majorBidi"/>
+      <w:i/>
+      <w:iCs/>
+      <w:color w:val="0F4761" w:themeColor="accent1" w:themeShade="BF"/>
+    </w:rPr>
+  </w:style>
+  <w:style w:type="paragraph" w:styleId="Heading5">
+    <w:name w:val="heading 5"/>
+    <w:basedOn w:val="Normal"/>
+    <w:next w:val="Normal"/>
+    <w:link w:val="Heading5Char"/>
+    <w:uiPriority w:val="9"/>
+    <w:semiHidden/>
+    <w:unhideWhenUsed/>
+    <w:qFormat/>
+    <w:rsid w:val="00712111"/>
+    <w:pPr>
+      <w:keepNext/>
+      <w:keepLines/>
+      <w:spacing w:before="80" w:after="40"/>
+      <w:outlineLvl w:val="4"/>
+    </w:pPr>
+    <w:rPr>
+      <w:rFonts w:eastAsiaTheme="majorEastAsia" w:cstheme="majorBidi"/>
+      <w:color w:val="0F4761" w:themeColor="accent1" w:themeShade="BF"/>
+    </w:rPr>
+  </w:style>
+  <w:style w:type="paragraph" w:styleId="Heading6">
+    <w:name w:val="heading 6"/>
+    <w:basedOn w:val="Normal"/>
+    <w:next w:val="Normal"/>
+    <w:link w:val="Heading6Char"/>
+    <w:uiPriority w:val="9"/>
+    <w:semiHidden/>
+    <w:unhideWhenUsed/>
+    <w:qFormat/>
+    <w:rsid w:val="00712111"/>
+    <w:pPr>
+      <w:keepNext/>
+      <w:keepLines/>
+      <w:spacing w:before="40"/>
+      <w:outlineLvl w:val="5"/>
+    </w:pPr>
+    <w:rPr>
+      <w:rFonts w:eastAsiaTheme="majorEastAsia" w:cstheme="majorBidi"/>
+      <w:i/>
+      <w:iCs/>
+      <w:color w:val="595959" w:themeColor="text1" w:themeTint="A6"/>
+    </w:rPr>
+  </w:style>
+  <w:style w:type="paragraph" w:styleId="Heading7">
+    <w:name w:val="heading 7"/>
+    <w:basedOn w:val="Normal"/>
+    <w:next w:val="Normal"/>
+    <w:link w:val="Heading7Char"/>
+    <w:uiPriority w:val="9"/>
+    <w:semiHidden/>
+    <w:unhideWhenUsed/>
+    <w:qFormat/>
+    <w:rsid w:val="00712111"/>
+    <w:pPr>
+      <w:keepNext/>
+      <w:keepLines/>
+      <w:spacing w:before="40"/>
+      <w:outlineLvl w:val="6"/>
+    </w:pPr>
+    <w:rPr>
+      <w:rFonts w:eastAsiaTheme="majorEastAsia" w:cstheme="majorBidi"/>
+      <w:color w:val="595959" w:themeColor="text1" w:themeTint="A6"/>
+    </w:rPr>
+  </w:style>
+  <w:style w:type="paragraph" w:styleId="Heading8">
+    <w:name w:val="heading 8"/>
+    <w:basedOn w:val="Normal"/>
+    <w:next w:val="Normal"/>
+    <w:link w:val="Heading8Char"/>
+    <w:uiPriority w:val="9"/>
+    <w:semiHidden/>
+    <w:unhideWhenUsed/>
+    <w:qFormat/>
+    <w:rsid w:val="00712111"/>
+    <w:pPr>
+      <w:keepNext/>
+      <w:keepLines/>
+      <w:outlineLvl w:val="7"/>
+    </w:pPr>
+    <w:rPr>
+      <w:rFonts w:eastAsiaTheme="majorEastAsia" w:cstheme="majorBidi"/>
+      <w:i/>
+      <w:iCs/>
+      <w:color w:val="272727" w:themeColor="text1" w:themeTint="D8"/>
+    </w:rPr>
+  </w:style>
+  <w:style w:type="paragraph" w:styleId="Heading9">
+    <w:name w:val="heading 9"/>
+    <w:basedOn w:val="Normal"/>
+    <w:next w:val="Normal"/>
+    <w:link w:val="Heading9Char"/>
+    <w:uiPriority w:val="9"/>
+    <w:semiHidden/>
+    <w:unhideWhenUsed/>
+    <w:qFormat/>
+    <w:rsid w:val="00712111"/>
+    <w:pPr>
+      <w:keepNext/>
+      <w:keepLines/>
+      <w:outlineLvl w:val="8"/>
+    </w:pPr>
+    <w:rPr>
+      <w:rFonts w:eastAsiaTheme="majorEastAsia" w:cstheme="majorBidi"/>
+      <w:color w:val="272727" w:themeColor="text1" w:themeTint="D8"/>
     </w:rPr>
   </w:style>
   <w:style w:type="character" w:default="1" w:styleId="DefaultParagraphFont">
@@ -2434,22 +2876,315 @@
     <w:semiHidden/>
     <w:unhideWhenUsed/>
   </w:style>
+  <w:style w:type="character" w:customStyle="1" w:styleId="Heading1Char">
+    <w:name w:val="Heading 1 Char"/>
+    <w:basedOn w:val="DefaultParagraphFont"/>
+    <w:link w:val="Heading1"/>
+    <w:uiPriority w:val="9"/>
+    <w:rsid w:val="00712111"/>
+    <w:rPr>
+      <w:rFonts w:asciiTheme="majorHAnsi" w:eastAsiaTheme="majorEastAsia" w:hAnsiTheme="majorHAnsi" w:cstheme="majorBidi"/>
+      <w:color w:val="0F4761" w:themeColor="accent1" w:themeShade="BF"/>
+      <w:sz w:val="40"/>
+      <w:szCs w:val="40"/>
+    </w:rPr>
+  </w:style>
+  <w:style w:type="character" w:customStyle="1" w:styleId="Heading2Char">
+    <w:name w:val="Heading 2 Char"/>
+    <w:basedOn w:val="DefaultParagraphFont"/>
+    <w:link w:val="Heading2"/>
+    <w:uiPriority w:val="9"/>
+    <w:semiHidden/>
+    <w:rsid w:val="00712111"/>
+    <w:rPr>
+      <w:rFonts w:asciiTheme="majorHAnsi" w:eastAsiaTheme="majorEastAsia" w:hAnsiTheme="majorHAnsi" w:cstheme="majorBidi"/>
+      <w:color w:val="0F4761" w:themeColor="accent1" w:themeShade="BF"/>
+      <w:sz w:val="32"/>
+      <w:szCs w:val="32"/>
+    </w:rPr>
+  </w:style>
+  <w:style w:type="character" w:customStyle="1" w:styleId="Heading3Char">
+    <w:name w:val="Heading 3 Char"/>
+    <w:basedOn w:val="DefaultParagraphFont"/>
+    <w:link w:val="Heading3"/>
+    <w:uiPriority w:val="9"/>
+    <w:semiHidden/>
+    <w:rsid w:val="00712111"/>
+    <w:rPr>
+      <w:rFonts w:eastAsiaTheme="majorEastAsia" w:cstheme="majorBidi"/>
+      <w:color w:val="0F4761" w:themeColor="accent1" w:themeShade="BF"/>
+      <w:sz w:val="28"/>
+      <w:szCs w:val="28"/>
+    </w:rPr>
+  </w:style>
+  <w:style w:type="character" w:customStyle="1" w:styleId="Heading4Char">
+    <w:name w:val="Heading 4 Char"/>
+    <w:basedOn w:val="DefaultParagraphFont"/>
+    <w:link w:val="Heading4"/>
+    <w:uiPriority w:val="9"/>
+    <w:semiHidden/>
+    <w:rsid w:val="00712111"/>
+    <w:rPr>
+      <w:rFonts w:eastAsiaTheme="majorEastAsia" w:cstheme="majorBidi"/>
+      <w:i/>
+      <w:iCs/>
+      <w:color w:val="0F4761" w:themeColor="accent1" w:themeShade="BF"/>
+    </w:rPr>
+  </w:style>
+  <w:style w:type="character" w:customStyle="1" w:styleId="Heading5Char">
+    <w:name w:val="Heading 5 Char"/>
+    <w:basedOn w:val="DefaultParagraphFont"/>
+    <w:link w:val="Heading5"/>
+    <w:uiPriority w:val="9"/>
+    <w:semiHidden/>
+    <w:rsid w:val="00712111"/>
+    <w:rPr>
+      <w:rFonts w:eastAsiaTheme="majorEastAsia" w:cstheme="majorBidi"/>
+      <w:color w:val="0F4761" w:themeColor="accent1" w:themeShade="BF"/>
+    </w:rPr>
+  </w:style>
+  <w:style w:type="character" w:customStyle="1" w:styleId="Heading6Char">
+    <w:name w:val="Heading 6 Char"/>
+    <w:basedOn w:val="DefaultParagraphFont"/>
+    <w:link w:val="Heading6"/>
+    <w:uiPriority w:val="9"/>
+    <w:semiHidden/>
+    <w:rsid w:val="00712111"/>
+    <w:rPr>
+      <w:rFonts w:eastAsiaTheme="majorEastAsia" w:cstheme="majorBidi"/>
+      <w:i/>
+      <w:iCs/>
+      <w:color w:val="595959" w:themeColor="text1" w:themeTint="A6"/>
+    </w:rPr>
+  </w:style>
+  <w:style w:type="character" w:customStyle="1" w:styleId="Heading7Char">
+    <w:name w:val="Heading 7 Char"/>
+    <w:basedOn w:val="DefaultParagraphFont"/>
+    <w:link w:val="Heading7"/>
+    <w:uiPriority w:val="9"/>
+    <w:semiHidden/>
+    <w:rsid w:val="00712111"/>
+    <w:rPr>
+      <w:rFonts w:eastAsiaTheme="majorEastAsia" w:cstheme="majorBidi"/>
+      <w:color w:val="595959" w:themeColor="text1" w:themeTint="A6"/>
+    </w:rPr>
+  </w:style>
+  <w:style w:type="character" w:customStyle="1" w:styleId="Heading8Char">
+    <w:name w:val="Heading 8 Char"/>
+    <w:basedOn w:val="DefaultParagraphFont"/>
+    <w:link w:val="Heading8"/>
+    <w:uiPriority w:val="9"/>
+    <w:semiHidden/>
+    <w:rsid w:val="00712111"/>
+    <w:rPr>
+      <w:rFonts w:eastAsiaTheme="majorEastAsia" w:cstheme="majorBidi"/>
+      <w:i/>
+      <w:iCs/>
+      <w:color w:val="272727" w:themeColor="text1" w:themeTint="D8"/>
+    </w:rPr>
+  </w:style>
+  <w:style w:type="character" w:customStyle="1" w:styleId="Heading9Char">
+    <w:name w:val="Heading 9 Char"/>
+    <w:basedOn w:val="DefaultParagraphFont"/>
+    <w:link w:val="Heading9"/>
+    <w:uiPriority w:val="9"/>
+    <w:semiHidden/>
+    <w:rsid w:val="00712111"/>
+    <w:rPr>
+      <w:rFonts w:eastAsiaTheme="majorEastAsia" w:cstheme="majorBidi"/>
+      <w:color w:val="272727" w:themeColor="text1" w:themeTint="D8"/>
+    </w:rPr>
+  </w:style>
+  <w:style w:type="paragraph" w:styleId="Title">
+    <w:name w:val="Title"/>
+    <w:basedOn w:val="Normal"/>
+    <w:next w:val="Normal"/>
+    <w:link w:val="TitleChar"/>
+    <w:uiPriority w:val="10"/>
+    <w:qFormat/>
+    <w:rsid w:val="00712111"/>
+    <w:pPr>
+      <w:spacing w:after="80"/>
+      <w:contextualSpacing/>
+    </w:pPr>
+    <w:rPr>
+      <w:rFonts w:asciiTheme="majorHAnsi" w:eastAsiaTheme="majorEastAsia" w:hAnsiTheme="majorHAnsi" w:cstheme="majorBidi"/>
+      <w:spacing w:val="-10"/>
+      <w:kern w:val="28"/>
+      <w:sz w:val="56"/>
+      <w:szCs w:val="56"/>
+    </w:rPr>
+  </w:style>
+  <w:style w:type="character" w:customStyle="1" w:styleId="TitleChar">
+    <w:name w:val="Title Char"/>
+    <w:basedOn w:val="DefaultParagraphFont"/>
+    <w:link w:val="Title"/>
+    <w:uiPriority w:val="10"/>
+    <w:rsid w:val="00712111"/>
+    <w:rPr>
+      <w:rFonts w:asciiTheme="majorHAnsi" w:eastAsiaTheme="majorEastAsia" w:hAnsiTheme="majorHAnsi" w:cstheme="majorBidi"/>
+      <w:spacing w:val="-10"/>
+      <w:kern w:val="28"/>
+      <w:sz w:val="56"/>
+      <w:szCs w:val="56"/>
+    </w:rPr>
+  </w:style>
+  <w:style w:type="paragraph" w:styleId="Subtitle">
+    <w:name w:val="Subtitle"/>
+    <w:basedOn w:val="Normal"/>
+    <w:next w:val="Normal"/>
+    <w:link w:val="SubtitleChar"/>
+    <w:uiPriority w:val="11"/>
+    <w:qFormat/>
+    <w:rsid w:val="00712111"/>
+    <w:pPr>
+      <w:numPr>
+        <w:ilvl w:val="1"/>
+      </w:numPr>
+    </w:pPr>
+    <w:rPr>
+      <w:rFonts w:eastAsiaTheme="majorEastAsia" w:cstheme="majorBidi"/>
+      <w:color w:val="595959" w:themeColor="text1" w:themeTint="A6"/>
+      <w:spacing w:val="15"/>
+      <w:sz w:val="28"/>
+      <w:szCs w:val="28"/>
+    </w:rPr>
+  </w:style>
+  <w:style w:type="character" w:customStyle="1" w:styleId="SubtitleChar">
+    <w:name w:val="Subtitle Char"/>
+    <w:basedOn w:val="DefaultParagraphFont"/>
+    <w:link w:val="Subtitle"/>
+    <w:uiPriority w:val="11"/>
+    <w:rsid w:val="00712111"/>
+    <w:rPr>
+      <w:rFonts w:eastAsiaTheme="majorEastAsia" w:cstheme="majorBidi"/>
+      <w:color w:val="595959" w:themeColor="text1" w:themeTint="A6"/>
+      <w:spacing w:val="15"/>
+      <w:sz w:val="28"/>
+      <w:szCs w:val="28"/>
+    </w:rPr>
+  </w:style>
+  <w:style w:type="paragraph" w:styleId="Quote">
+    <w:name w:val="Quote"/>
+    <w:basedOn w:val="Normal"/>
+    <w:next w:val="Normal"/>
+    <w:link w:val="QuoteChar"/>
+    <w:uiPriority w:val="29"/>
+    <w:qFormat/>
+    <w:rsid w:val="00712111"/>
+    <w:pPr>
+      <w:spacing w:before="160"/>
+      <w:jc w:val="center"/>
+    </w:pPr>
+    <w:rPr>
+      <w:i/>
+      <w:iCs/>
+      <w:color w:val="404040" w:themeColor="text1" w:themeTint="BF"/>
+    </w:rPr>
+  </w:style>
+  <w:style w:type="character" w:customStyle="1" w:styleId="QuoteChar">
+    <w:name w:val="Quote Char"/>
+    <w:basedOn w:val="DefaultParagraphFont"/>
+    <w:link w:val="Quote"/>
+    <w:uiPriority w:val="29"/>
+    <w:rsid w:val="00712111"/>
+    <w:rPr>
+      <w:i/>
+      <w:iCs/>
+      <w:color w:val="404040" w:themeColor="text1" w:themeTint="BF"/>
+    </w:rPr>
+  </w:style>
+  <w:style w:type="paragraph" w:styleId="ListParagraph">
+    <w:name w:val="List Paragraph"/>
+    <w:basedOn w:val="Normal"/>
+    <w:uiPriority w:val="34"/>
+    <w:qFormat/>
+    <w:rsid w:val="00712111"/>
+    <w:pPr>
+      <w:ind w:left="720"/>
+      <w:contextualSpacing/>
+    </w:pPr>
+  </w:style>
+  <w:style w:type="character" w:styleId="IntenseEmphasis">
+    <w:name w:val="Intense Emphasis"/>
+    <w:basedOn w:val="DefaultParagraphFont"/>
+    <w:uiPriority w:val="21"/>
+    <w:qFormat/>
+    <w:rsid w:val="00712111"/>
+    <w:rPr>
+      <w:i/>
+      <w:iCs/>
+      <w:color w:val="0F4761" w:themeColor="accent1" w:themeShade="BF"/>
+    </w:rPr>
+  </w:style>
+  <w:style w:type="paragraph" w:styleId="IntenseQuote">
+    <w:name w:val="Intense Quote"/>
+    <w:basedOn w:val="Normal"/>
+    <w:next w:val="Normal"/>
+    <w:link w:val="IntenseQuoteChar"/>
+    <w:uiPriority w:val="30"/>
+    <w:qFormat/>
+    <w:rsid w:val="00712111"/>
+    <w:pPr>
+      <w:pBdr>
+        <w:top w:val="single" w:sz="4" w:space="10" w:color="0F4761" w:themeColor="accent1" w:themeShade="BF"/>
+        <w:bottom w:val="single" w:sz="4" w:space="10" w:color="0F4761" w:themeColor="accent1" w:themeShade="BF"/>
+      </w:pBdr>
+      <w:spacing w:before="360" w:after="360"/>
+      <w:ind w:left="864" w:right="864"/>
+      <w:jc w:val="center"/>
+    </w:pPr>
+    <w:rPr>
+      <w:i/>
+      <w:iCs/>
+      <w:color w:val="0F4761" w:themeColor="accent1" w:themeShade="BF"/>
+    </w:rPr>
+  </w:style>
+  <w:style w:type="character" w:customStyle="1" w:styleId="IntenseQuoteChar">
+    <w:name w:val="Intense Quote Char"/>
+    <w:basedOn w:val="DefaultParagraphFont"/>
+    <w:link w:val="IntenseQuote"/>
+    <w:uiPriority w:val="30"/>
+    <w:rsid w:val="00712111"/>
+    <w:rPr>
+      <w:i/>
+      <w:iCs/>
+      <w:color w:val="0F4761" w:themeColor="accent1" w:themeShade="BF"/>
+    </w:rPr>
+  </w:style>
+  <w:style w:type="character" w:styleId="IntenseReference">
+    <w:name w:val="Intense Reference"/>
+    <w:basedOn w:val="DefaultParagraphFont"/>
+    <w:uiPriority w:val="32"/>
+    <w:qFormat/>
+    <w:rsid w:val="00712111"/>
+    <w:rPr>
+      <w:b/>
+      <w:bCs/>
+      <w:smallCaps/>
+      <w:color w:val="0F4761" w:themeColor="accent1" w:themeShade="BF"/>
+      <w:spacing w:val="5"/>
+    </w:rPr>
+  </w:style>
   <w:style w:type="paragraph" w:styleId="NoSpacing">
     <w:name w:val="No Spacing"/>
     <w:uiPriority w:val="1"/>
     <w:qFormat/>
-    <w:rsid w:val="000A7960"/>
+    <w:rsid w:val="00712111"/>
     <w:pPr>
       <w:spacing w:after="0" w:line="240" w:lineRule="auto"/>
     </w:pPr>
     <w:rPr>
       <w:rFonts w:ascii="Calibri" w:eastAsia="Calibri" w:hAnsi="Calibri" w:cs="Times New Roman"/>
-      <w:lang w:val="en-IN" w:bidi="ar-SA"/>
+      <w:kern w:val="0"/>
+      <w:sz w:val="22"/>
+      <w:szCs w:val="22"/>
+      <w14:ligatures w14:val="none"/>
     </w:rPr>
   </w:style>
   <w:style w:type="paragraph" w:customStyle="1" w:styleId="Default">
     <w:name w:val="Default"/>
-    <w:rsid w:val="000A7960"/>
+    <w:rsid w:val="00712111"/>
     <w:pPr>
       <w:autoSpaceDE w:val="0"/>
       <w:autoSpaceDN w:val="0"/>
@@ -2459,9 +3194,8 @@
     <w:rPr>
       <w:rFonts w:ascii="Times New Roman" w:eastAsia="Calibri" w:hAnsi="Times New Roman" w:cs="Times New Roman"/>
       <w:color w:val="000000"/>
-      <w:sz w:val="24"/>
-      <w:szCs w:val="24"/>
-      <w:lang w:val="en-IN" w:bidi="ar-SA"/>
+      <w:kern w:val="0"/>
+      <w14:ligatures w14:val="none"/>
     </w:rPr>
   </w:style>
 </w:styles>
@@ -2478,44 +3212,44 @@
         <a:sysClr val="window" lastClr="FFFFFF"/>
       </a:lt1>
       <a:dk2>
-        <a:srgbClr val="1F497D"/>
+        <a:srgbClr val="0E2841"/>
       </a:dk2>
       <a:lt2>
-        <a:srgbClr val="EEECE1"/>
+        <a:srgbClr val="E8E8E8"/>
       </a:lt2>
       <a:accent1>
-        <a:srgbClr val="4F81BD"/>
+        <a:srgbClr val="156082"/>
       </a:accent1>
       <a:accent2>
-        <a:srgbClr val="C0504D"/>
+        <a:srgbClr val="E97132"/>
       </a:accent2>
       <a:accent3>
-        <a:srgbClr val="9BBB59"/>
+        <a:srgbClr val="196B24"/>
       </a:accent3>
       <a:accent4>
-        <a:srgbClr val="8064A2"/>
+        <a:srgbClr val="0F9ED5"/>
       </a:accent4>
       <a:accent5>
-        <a:srgbClr val="4BACC6"/>
+        <a:srgbClr val="A02B93"/>
       </a:accent5>
       <a:accent6>
-        <a:srgbClr val="F79646"/>
+        <a:srgbClr val="4EA72E"/>
       </a:accent6>
       <a:hlink>
-        <a:srgbClr val="0000FF"/>
+        <a:srgbClr val="467886"/>
       </a:hlink>
       <a:folHlink>
-        <a:srgbClr val="800080"/>
+        <a:srgbClr val="96607D"/>
       </a:folHlink>
     </a:clrScheme>
     <a:fontScheme name="Office">
       <a:majorFont>
-        <a:latin typeface="Cambria"/>
+        <a:latin typeface="Aptos Display" panose="02110004020202020204"/>
         <a:ea typeface=""/>
         <a:cs typeface=""/>
-        <a:font script="Jpan" typeface="ＭＳ ゴシック"/>
+        <a:font script="Jpan" typeface="游ゴシック Light"/>
         <a:font script="Hang" typeface="맑은 고딕"/>
-        <a:font script="Hans" typeface="宋体"/>
+        <a:font script="Hans" typeface="等线 Light"/>
         <a:font script="Hant" typeface="新細明體"/>
         <a:font script="Arab" typeface="Times New Roman"/>
         <a:font script="Hebr" typeface="Times New Roman"/>
@@ -2542,14 +3276,32 @@
         <a:font script="Mong" typeface="Mongolian Baiti"/>
         <a:font script="Viet" typeface="Times New Roman"/>
         <a:font script="Uigh" typeface="Microsoft Uighur"/>
+        <a:font script="Geor" typeface="Sylfaen"/>
+        <a:font script="Armn" typeface="Arial"/>
+        <a:font script="Bugi" typeface="Leelawadee UI"/>
+        <a:font script="Bopo" typeface="Microsoft JhengHei"/>
+        <a:font script="Java" typeface="Javanese Text"/>
+        <a:font script="Lisu" typeface="Segoe UI"/>
+        <a:font script="Mymr" typeface="Myanmar Text"/>
+        <a:font script="Nkoo" typeface="Ebrima"/>
+        <a:font script="Olck" typeface="Nirmala UI"/>
+        <a:font script="Osma" typeface="Ebrima"/>
+        <a:font script="Phag" typeface="Phagspa"/>
+        <a:font script="Syrn" typeface="Estrangelo Edessa"/>
+        <a:font script="Syrj" typeface="Estrangelo Edessa"/>
+        <a:font script="Syre" typeface="Estrangelo Edessa"/>
+        <a:font script="Sora" typeface="Nirmala UI"/>
+        <a:font script="Tale" typeface="Microsoft Tai Le"/>
+        <a:font script="Talu" typeface="Microsoft New Tai Lue"/>
+        <a:font script="Tfng" typeface="Ebrima"/>
       </a:majorFont>
       <a:minorFont>
-        <a:latin typeface="Calibri"/>
+        <a:latin typeface="Aptos" panose="02110004020202020204"/>
         <a:ea typeface=""/>
         <a:cs typeface=""/>
-        <a:font script="Jpan" typeface="ＭＳ 明朝"/>
+        <a:font script="Jpan" typeface="游明朝"/>
         <a:font script="Hang" typeface="맑은 고딕"/>
-        <a:font script="Hans" typeface="宋体"/>
+        <a:font script="Hans" typeface="等线"/>
         <a:font script="Hant" typeface="新細明體"/>
         <a:font script="Arab" typeface="Arial"/>
         <a:font script="Hebr" typeface="Arial"/>
@@ -2576,6 +3328,24 @@
         <a:font script="Mong" typeface="Mongolian Baiti"/>
         <a:font script="Viet" typeface="Arial"/>
         <a:font script="Uigh" typeface="Microsoft Uighur"/>
+        <a:font script="Geor" typeface="Sylfaen"/>
+        <a:font script="Armn" typeface="Arial"/>
+        <a:font script="Bugi" typeface="Leelawadee UI"/>
+        <a:font script="Bopo" typeface="Microsoft JhengHei"/>
+        <a:font script="Java" typeface="Javanese Text"/>
+        <a:font script="Lisu" typeface="Segoe UI"/>
+        <a:font script="Mymr" typeface="Myanmar Text"/>
+        <a:font script="Nkoo" typeface="Ebrima"/>
+        <a:font script="Olck" typeface="Nirmala UI"/>
+        <a:font script="Osma" typeface="Ebrima"/>
+        <a:font script="Phag" typeface="Phagspa"/>
+        <a:font script="Syrn" typeface="Estrangelo Edessa"/>
+        <a:font script="Syrj" typeface="Estrangelo Edessa"/>
+        <a:font script="Syre" typeface="Estrangelo Edessa"/>
+        <a:font script="Sora" typeface="Nirmala UI"/>
+        <a:font script="Tale" typeface="Microsoft Tai Le"/>
+        <a:font script="Talu" typeface="Microsoft New Tai Lue"/>
+        <a:font script="Tfng" typeface="Ebrima"/>
       </a:minorFont>
     </a:fontScheme>
     <a:fmtScheme name="Office">
@@ -2587,165 +3357,161 @@
           <a:gsLst>
             <a:gs pos="0">
               <a:schemeClr val="phClr">
-                <a:tint val="50000"/>
-                <a:satMod val="300000"/>
+                <a:lumMod val="110000"/>
+                <a:satMod val="105000"/>
+                <a:tint val="67000"/>
               </a:schemeClr>
             </a:gs>
-            <a:gs pos="35000">
+            <a:gs pos="50000">
               <a:schemeClr val="phClr">
-                <a:tint val="37000"/>
-                <a:satMod val="300000"/>
+                <a:lumMod val="105000"/>
+                <a:satMod val="103000"/>
+                <a:tint val="73000"/>
               </a:schemeClr>
             </a:gs>
             <a:gs pos="100000">
               <a:schemeClr val="phClr">
-                <a:tint val="15000"/>
-                <a:satMod val="350000"/>
+                <a:lumMod val="105000"/>
+                <a:satMod val="109000"/>
+                <a:tint val="81000"/>
               </a:schemeClr>
             </a:gs>
           </a:gsLst>
-          <a:lin ang="16200000" scaled="1"/>
+          <a:lin ang="5400000" scaled="0"/>
         </a:gradFill>
         <a:gradFill rotWithShape="1">
           <a:gsLst>
             <a:gs pos="0">
               <a:schemeClr val="phClr">
-                <a:shade val="51000"/>
-                <a:satMod val="130000"/>
+                <a:satMod val="103000"/>
+                <a:lumMod val="102000"/>
+                <a:tint val="94000"/>
               </a:schemeClr>
             </a:gs>
-            <a:gs pos="80000">
+            <a:gs pos="50000">
               <a:schemeClr val="phClr">
-                <a:shade val="93000"/>
-                <a:satMod val="130000"/>
+                <a:satMod val="110000"/>
+                <a:lumMod val="100000"/>
+                <a:shade val="100000"/>
               </a:schemeClr>
             </a:gs>
             <a:gs pos="100000">
               <a:schemeClr val="phClr">
-                <a:shade val="94000"/>
-                <a:satMod val="135000"/>
+                <a:lumMod val="99000"/>
+                <a:satMod val="120000"/>
+                <a:shade val="78000"/>
               </a:schemeClr>
             </a:gs>
           </a:gsLst>
-          <a:lin ang="16200000" scaled="0"/>
+          <a:lin ang="5400000" scaled="0"/>
         </a:gradFill>
       </a:fillStyleLst>
       <a:lnStyleLst>
-        <a:ln w="9525" cap="flat" cmpd="sng" algn="ctr">
+        <a:ln w="12700" cap="flat" cmpd="sng" algn="ctr">
           <a:solidFill>
-            <a:schemeClr val="phClr">
-              <a:shade val="95000"/>
-              <a:satMod val="105000"/>
-            </a:schemeClr>
+            <a:schemeClr val="phClr"/>
           </a:solidFill>
           <a:prstDash val="solid"/>
+          <a:miter lim="800000"/>
+        </a:ln>
+        <a:ln w="19050" cap="flat" cmpd="sng" algn="ctr">
+          <a:solidFill>
+            <a:schemeClr val="phClr"/>
+          </a:solidFill>
+          <a:prstDash val="solid"/>
+          <a:miter lim="800000"/>
         </a:ln>
         <a:ln w="25400" cap="flat" cmpd="sng" algn="ctr">
           <a:solidFill>
             <a:schemeClr val="phClr"/>
           </a:solidFill>
           <a:prstDash val="solid"/>
-        </a:ln>
-        <a:ln w="38100" cap="flat" cmpd="sng" algn="ctr">
-          <a:solidFill>
-            <a:schemeClr val="phClr"/>
-          </a:solidFill>
-          <a:prstDash val="solid"/>
+          <a:miter lim="800000"/>
         </a:ln>
       </a:lnStyleLst>
       <a:effectStyleLst>
         <a:effectStyle>
+          <a:effectLst/>
+        </a:effectStyle>
+        <a:effectStyle>
+          <a:effectLst/>
+        </a:effectStyle>
+        <a:effectStyle>
           <a:effectLst>
-            <a:outerShdw blurRad="40000" dist="20000" dir="5400000" rotWithShape="0">
+            <a:outerShdw blurRad="57150" dist="19050" dir="5400000" algn="ctr" rotWithShape="0">
               <a:srgbClr val="000000">
-                <a:alpha val="38000"/>
+                <a:alpha val="63000"/>
               </a:srgbClr>
             </a:outerShdw>
           </a:effectLst>
-        </a:effectStyle>
-        <a:effectStyle>
-          <a:effectLst>
-            <a:outerShdw blurRad="40000" dist="23000" dir="5400000" rotWithShape="0">
-              <a:srgbClr val="000000">
-                <a:alpha val="35000"/>
-              </a:srgbClr>
-            </a:outerShdw>
-          </a:effectLst>
-        </a:effectStyle>
-        <a:effectStyle>
-          <a:effectLst>
-            <a:outerShdw blurRad="40000" dist="23000" dir="5400000" rotWithShape="0">
-              <a:srgbClr val="000000">
-                <a:alpha val="35000"/>
-              </a:srgbClr>
-            </a:outerShdw>
-          </a:effectLst>
-          <a:scene3d>
-            <a:camera prst="orthographicFront">
-              <a:rot lat="0" lon="0" rev="0"/>
-            </a:camera>
-            <a:lightRig rig="threePt" dir="t">
-              <a:rot lat="0" lon="0" rev="1200000"/>
-            </a:lightRig>
-          </a:scene3d>
-          <a:sp3d>
-            <a:bevelT w="63500" h="25400"/>
-          </a:sp3d>
         </a:effectStyle>
       </a:effectStyleLst>
       <a:bgFillStyleLst>
         <a:solidFill>
           <a:schemeClr val="phClr"/>
         </a:solidFill>
+        <a:solidFill>
+          <a:schemeClr val="phClr">
+            <a:tint val="95000"/>
+            <a:satMod val="170000"/>
+          </a:schemeClr>
+        </a:solidFill>
         <a:gradFill rotWithShape="1">
           <a:gsLst>
             <a:gs pos="0">
               <a:schemeClr val="phClr">
-                <a:tint val="40000"/>
-                <a:satMod val="350000"/>
+                <a:tint val="93000"/>
+                <a:satMod val="150000"/>
+                <a:shade val="98000"/>
+                <a:lumMod val="102000"/>
               </a:schemeClr>
             </a:gs>
-            <a:gs pos="40000">
+            <a:gs pos="50000">
               <a:schemeClr val="phClr">
-                <a:tint val="45000"/>
-                <a:shade val="99000"/>
-                <a:satMod val="350000"/>
+                <a:tint val="98000"/>
+                <a:satMod val="130000"/>
+                <a:shade val="90000"/>
+                <a:lumMod val="103000"/>
               </a:schemeClr>
             </a:gs>
             <a:gs pos="100000">
               <a:schemeClr val="phClr">
-                <a:shade val="20000"/>
-                <a:satMod val="255000"/>
+                <a:shade val="63000"/>
+                <a:satMod val="120000"/>
               </a:schemeClr>
             </a:gs>
           </a:gsLst>
-          <a:path path="circle">
-            <a:fillToRect l="50000" t="-80000" r="50000" b="180000"/>
-          </a:path>
-        </a:gradFill>
-        <a:gradFill rotWithShape="1">
-          <a:gsLst>
-            <a:gs pos="0">
-              <a:schemeClr val="phClr">
-                <a:tint val="80000"/>
-                <a:satMod val="300000"/>
-              </a:schemeClr>
-            </a:gs>
-            <a:gs pos="100000">
-              <a:schemeClr val="phClr">
-                <a:shade val="30000"/>
-                <a:satMod val="200000"/>
-              </a:schemeClr>
-            </a:gs>
-          </a:gsLst>
-          <a:path path="circle">
-            <a:fillToRect l="50000" t="50000" r="50000" b="50000"/>
-          </a:path>
+          <a:lin ang="5400000" scaled="0"/>
         </a:gradFill>
       </a:bgFillStyleLst>
     </a:fmtScheme>
   </a:themeElements>
-  <a:objectDefaults/>
+  <a:objectDefaults>
+    <a:lnDef>
+      <a:spPr/>
+      <a:bodyPr/>
+      <a:lstStyle/>
+      <a:style>
+        <a:lnRef idx="2">
+          <a:schemeClr val="accent1"/>
+        </a:lnRef>
+        <a:fillRef idx="0">
+          <a:schemeClr val="accent1"/>
+        </a:fillRef>
+        <a:effectRef idx="1">
+          <a:schemeClr val="accent1"/>
+        </a:effectRef>
+        <a:fontRef idx="minor">
+          <a:schemeClr val="tx1"/>
+        </a:fontRef>
+      </a:style>
+    </a:lnDef>
+  </a:objectDefaults>
   <a:extraClrSchemeLst/>
+  <a:extLst>
+    <a:ext uri="{05A4C25C-085E-4340-85A3-A5531E510DB2}">
+      <thm15:themeFamily xmlns:thm15="http://schemas.microsoft.com/office/thememl/2012/main" name="Office Theme" id="{2E142A2C-CD16-42D6-873A-C26D2A0506FA}" vid="{1BDDFF52-6CD6-40A5-AB3C-68EB2F1E4D0A}"/>
+    </a:ext>
+  </a:extLst>
 </a:theme>
 </file>
</xml_diff>

<commit_message>
Intimation: add Tender Id to the reference line
The Ref line's "E-Proc Nit No : {{Nit No}}" is now followed by
"Tender Id: {{Tender Id}}", filled from the uploaded L-1 (pdf.tenderId).

Co-Authored-By: Claude Opus 4.8 <noreply@anthropic.com>
</commit_message>
<xml_diff>
--- a/resources/intimation-template.docx
+++ b/resources/intimation-template.docx
@@ -798,6 +798,14 @@
           <w:lang w:val="en-US"/>
         </w:rPr>
         <w:t>{{Nit No}}</w:t>
+      </w:r>
+      <w:r>
+        <w:rPr>
+          <w:sz w:val="20"/>
+          <w:szCs w:val="20"/>
+          <w:lang w:val="en-US"/>
+        </w:rPr>
+        <w:t xml:space="preserve">, Tender Id: {{Tender Id}}</w:t>
       </w:r>
     </w:p>
     <w:p>

</xml_diff>